<commit_message>
Product note: interview evidence, current workaround, key decisions, deliberate exclusions, primary metric and next test
Co-Authored-By: Claude Sonnet 5.5 <noreply@anthropic.com>
Claude-Session: https://claude.ai/code/session_01UkYraoXMEPqUCAeqnCcg3Y
</commit_message>
<xml_diff>
--- a/note/product-note.docx
+++ b/note/product-note.docx
@@ -29,7 +29,7 @@
           <w:sz w:val="18"/>
           <w:szCs w:val="18"/>
         </w:rPr>
-        <w:t xml:space="preserve">A Hindi voice agent for bounced personal-loan EMIs: it holds the call, then decides whether the AI, a person or the field team takes the borrower next.</w:t>
+        <w:t xml:space="preserve">A Hindi voice agent for bounced personal-loan EMIs: it holds the call, then recommends whether the AI or a person takes the borrower next.</w:t>
       </w:r>
     </w:p>
     <w:p>
@@ -80,29 +80,18 @@
           <w:sz w:val="17"/>
           <w:szCs w:val="17"/>
         </w:rPr>
-        <w:t xml:space="preserve">India's personal-loan book is 12.7 crore live loans, most of them small-ticket, and roughly one EMI auto-debit in three fails. </w:t>
-      </w:r>
-      <w:r>
-        <w:rPr>
-          <w:rFonts w:ascii="Calibri" w:cs="Calibri" w:eastAsia="Calibri" w:hAnsi="Calibri"/>
-          <w:b/>
-          <w:bCs/>
-          <w:color w:val="11243A"/>
-          <w:sz w:val="17"/>
-          <w:szCs w:val="17"/>
-        </w:rPr>
-        <w:t xml:space="preserve">Recovery is then bought in headcount — one caller covers about 400 borrowers — so chasing more bounces means hiring more people, each calling without the borrower's history and logging a one-word reason. </w:t>
-      </w:r>
-      <w:r>
-        <w:rPr>
-          <w:rFonts w:ascii="Calibri" w:cs="Calibri" w:eastAsia="Calibri" w:hAnsi="Calibri"/>
-          <w:b/>
-          <w:bCs/>
-          <w:color w:val="11243A"/>
-          <w:sz w:val="17"/>
-          <w:szCs w:val="17"/>
-        </w:rPr>
-        <w:t xml:space="preserve">The decision that actually moves money, which borrower deserves which kind of effort, is never made at all.</w:t>
+        <w:t xml:space="preserve">For the head of collections at an NBFC: roughly one EMI auto-debit in three fails, and recovery is bought in headcount. </w:t>
+      </w:r>
+      <w:r>
+        <w:rPr>
+          <w:rFonts w:ascii="Calibri" w:cs="Calibri" w:eastAsia="Calibri" w:hAnsi="Calibri"/>
+          <w:b/>
+          <w:bCs/>
+          <w:color w:val="11243A"/>
+          <w:sz w:val="17"/>
+          <w:szCs w:val="17"/>
+        </w:rPr>
+        <w:t xml:space="preserve">One caller covers about 400 borrowers, so chasing more bounces means hiring more people. The decision that moves money, which borrower deserves which kind of effort, is made by feel.</w:t>
       </w:r>
     </w:p>
     <w:tbl>
@@ -366,7 +355,7 @@
                 <w:sz w:val="15"/>
                 <w:szCs w:val="15"/>
               </w:rPr>
-              <w:t xml:space="preserve">Typical ticket</w:t>
+              <w:t xml:space="preserve">EMI auto-debits that fail</w:t>
             </w:r>
           </w:p>
         </w:tc>
@@ -399,7 +388,7 @@
                 <w:sz w:val="15"/>
                 <w:szCs w:val="15"/>
               </w:rPr>
-              <w:t xml:space="preserve">₹61,112 on average, but ₹18,802 at digital NBFCs, who write 70% of sanctions by volume</w:t>
+              <w:t xml:space="preserve">~29% of NACH debits by volume, 22% by value</w:t>
             </w:r>
           </w:p>
         </w:tc>
@@ -432,7 +421,7 @@
                 <w:sz w:val="15"/>
                 <w:szCs w:val="15"/>
               </w:rPr>
-              <w:t xml:space="preserve">CRIF High Mark; FACE</w:t>
+              <w:t xml:space="preserve">NPCI data (public series ends 2022)</w:t>
             </w:r>
           </w:p>
         </w:tc>
@@ -470,7 +459,7 @@
                 <w:sz w:val="15"/>
                 <w:szCs w:val="15"/>
               </w:rPr>
-              <w:t xml:space="preserve">EMI auto-debits that fail</w:t>
+              <w:t xml:space="preserve">Still unpaid 31–180 days later</w:t>
             </w:r>
           </w:p>
         </w:tc>
@@ -503,7 +492,7 @@
                 <w:sz w:val="15"/>
                 <w:szCs w:val="15"/>
               </w:rPr>
-              <w:t xml:space="preserve">~29% of NACH debits by volume, 22% by value</w:t>
+              <w:t xml:space="preserve">2.3% of the book ≈ ₹39,000 crore; 5.7% for small-ticket NBFC loans</w:t>
             </w:r>
           </w:p>
         </w:tc>
@@ -536,7 +525,7 @@
                 <w:sz w:val="15"/>
                 <w:szCs w:val="15"/>
               </w:rPr>
-              <w:t xml:space="preserve">NPCI data (public series ends 2022)</w:t>
+              <w:t xml:space="preserve">CRIF Jun-26; rupee figure is my arithmetic</w:t>
             </w:r>
           </w:p>
         </w:tc>
@@ -574,7 +563,7 @@
                 <w:sz w:val="15"/>
                 <w:szCs w:val="15"/>
               </w:rPr>
-              <w:t xml:space="preserve">Still unpaid 31–180 days later</w:t>
+              <w:t xml:space="preserve">What chasing it costs</w:t>
             </w:r>
           </w:p>
         </w:tc>
@@ -607,7 +596,7 @@
                 <w:sz w:val="15"/>
                 <w:szCs w:val="15"/>
               </w:rPr>
-              <w:t xml:space="preserve">2.3% of the book ≈ ₹39,000 crore; 5.7% for small-ticket NBFC loans</w:t>
+              <w:t xml:space="preserve">₹11 a minute of human calling; one caller covers ~400 borrowers</w:t>
             </w:r>
           </w:p>
         </w:tc>
@@ -640,111 +629,7 @@
                 <w:sz w:val="15"/>
                 <w:szCs w:val="15"/>
               </w:rPr>
-              <w:t xml:space="preserve">CRIF Jun-26; rupee figure is my arithmetic</w:t>
-            </w:r>
-          </w:p>
-        </w:tc>
-      </w:tr>
-      <w:tr>
-        <w:trPr>
-          <w:tblHeader w:val="false"/>
-        </w:trPr>
-        <w:tc>
-          <w:tcPr>
-            <w:tcW w:type="dxa" w:w="2750"/>
-            <w:tcBorders>
-              <w:top w:val="single" w:color="C9D2E0" w:sz="2"/>
-              <w:left w:val="none" w:color="FFFFFF" w:sz="0"/>
-              <w:bottom w:val="single" w:color="C9D2E0" w:sz="2"/>
-              <w:right w:val="none" w:color="FFFFFF" w:sz="0"/>
-            </w:tcBorders>
-            <w:tcMar>
-              <w:top w:type="dxa" w:w="40"/>
-              <w:left w:type="dxa" w:w="85"/>
-              <w:bottom w:type="dxa" w:w="40"/>
-              <w:right w:type="dxa" w:w="85"/>
-            </w:tcMar>
-          </w:tcPr>
-          <w:p>
-            <w:pPr>
-              <w:spacing w:after="0" w:line="205"/>
-            </w:pPr>
-            <w:r>
-              <w:rPr>
-                <w:rFonts w:ascii="Calibri" w:cs="Calibri" w:eastAsia="Calibri" w:hAnsi="Calibri"/>
-                <w:b w:val="false"/>
-                <w:bCs w:val="false"/>
-                <w:color w:val="11243A"/>
-                <w:sz w:val="15"/>
-                <w:szCs w:val="15"/>
-              </w:rPr>
-              <w:t xml:space="preserve">What chasing it costs</w:t>
-            </w:r>
-          </w:p>
-        </w:tc>
-        <w:tc>
-          <w:tcPr>
-            <w:tcW w:type="dxa" w:w="4100"/>
-            <w:tcBorders>
-              <w:top w:val="single" w:color="C9D2E0" w:sz="2"/>
-              <w:left w:val="none" w:color="FFFFFF" w:sz="0"/>
-              <w:bottom w:val="single" w:color="C9D2E0" w:sz="2"/>
-              <w:right w:val="none" w:color="FFFFFF" w:sz="0"/>
-            </w:tcBorders>
-            <w:tcMar>
-              <w:top w:type="dxa" w:w="40"/>
-              <w:left w:type="dxa" w:w="85"/>
-              <w:bottom w:type="dxa" w:w="40"/>
-              <w:right w:type="dxa" w:w="85"/>
-            </w:tcMar>
-          </w:tcPr>
-          <w:p>
-            <w:pPr>
-              <w:spacing w:after="0" w:line="205"/>
-            </w:pPr>
-            <w:r>
-              <w:rPr>
-                <w:rFonts w:ascii="Calibri" w:cs="Calibri" w:eastAsia="Calibri" w:hAnsi="Calibri"/>
-                <w:b w:val="false"/>
-                <w:bCs w:val="false"/>
-                <w:color w:val="5B6B85"/>
-                <w:sz w:val="15"/>
-                <w:szCs w:val="15"/>
-              </w:rPr>
-              <w:t xml:space="preserve">₹11 a minute of human calling, and one caller covers ~400 borrowers</w:t>
-            </w:r>
-          </w:p>
-        </w:tc>
-        <w:tc>
-          <w:tcPr>
-            <w:tcW w:type="dxa" w:w="2390"/>
-            <w:tcBorders>
-              <w:top w:val="single" w:color="C9D2E0" w:sz="2"/>
-              <w:left w:val="none" w:color="FFFFFF" w:sz="0"/>
-              <w:bottom w:val="single" w:color="C9D2E0" w:sz="2"/>
-              <w:right w:val="none" w:color="FFFFFF" w:sz="0"/>
-            </w:tcBorders>
-            <w:tcMar>
-              <w:top w:type="dxa" w:w="40"/>
-              <w:left w:type="dxa" w:w="85"/>
-              <w:bottom w:type="dxa" w:w="40"/>
-              <w:right w:type="dxa" w:w="85"/>
-            </w:tcMar>
-          </w:tcPr>
-          <w:p>
-            <w:pPr>
-              <w:spacing w:after="0" w:line="205"/>
-            </w:pPr>
-            <w:r>
-              <w:rPr>
-                <w:rFonts w:ascii="Calibri" w:cs="Calibri" w:eastAsia="Calibri" w:hAnsi="Calibri"/>
-                <w:b w:val="false"/>
-                <w:bCs w:val="false"/>
-                <w:color w:val="5B6B85"/>
-                <w:sz w:val="15"/>
-                <w:szCs w:val="15"/>
-              </w:rPr>
-              <w:t xml:space="preserve">Lender interview</w:t>
+              <w:t xml:space="preserve">Lender interviews</w:t>
             </w:r>
           </w:p>
         </w:tc>
@@ -752,7 +637,25 @@
     </w:tbl>
     <w:p>
       <w:pPr>
-        <w:spacing w:after="38" w:before="65"/>
+        <w:spacing w:after="45" w:before="105"/>
+      </w:pPr>
+      <w:r>
+        <w:rPr>
+          <w:rFonts w:ascii="Calibri" w:cs="Calibri" w:eastAsia="Calibri" w:hAnsi="Calibri"/>
+          <w:b/>
+          <w:bCs/>
+          <w:caps/>
+          <w:color w:val="1A4FD6"/>
+          <w:spacing w:val="20"/>
+          <w:sz w:val="18"/>
+          <w:szCs w:val="18"/>
+        </w:rPr>
+        <w:t xml:space="preserve">What we heard, and how it is handled today</w:t>
+      </w:r>
+    </w:p>
+    <w:p>
+      <w:pPr>
+        <w:spacing w:after="55" w:line="225"/>
       </w:pPr>
       <w:r>
         <w:rPr>
@@ -761,7 +664,7 @@
           <w:sz w:val="16"/>
           <w:szCs w:val="16"/>
         </w:rPr>
-        <w:t xml:space="preserve">Four reasons it stays uncollected:</w:t>
+        <w:t xml:space="preserve">Three interviews at an Indian lender that runs collections in-house: a product lead, a collections analyst and a data-science lead.</w:t>
       </w:r>
     </w:p>
     <w:p>
@@ -783,7 +686,7 @@
           <w:sz w:val="17"/>
           <w:szCs w:val="17"/>
         </w:rPr>
-        <w:t xml:space="preserve">Calling capacity cannot scale. </w:t>
+        <w:t xml:space="preserve">A fixed pattern. </w:t>
       </w:r>
       <w:r>
         <w:rPr>
@@ -792,7 +695,7 @@
           <w:sz w:val="16"/>
           <w:szCs w:val="16"/>
         </w:rPr>
-        <w:t xml:space="preserve">More book means more agents, each needing training and a ramp, against NBFC attrition reported near 77% a year. Cost per rupee recovered rises exactly when the book grows.</w:t>
+        <w:t xml:space="preserve">Bounces drop into the CRM and each agent places 900–1,000 calls a day, repeating until a positive disposition. A promise just schedules a callback. Good agents prioritise in Excel and follow up on WhatsApp, which is encouraged but not tracked.</w:t>
       </w:r>
     </w:p>
     <w:p>
@@ -814,7 +717,7 @@
           <w:sz w:val="17"/>
           <w:szCs w:val="17"/>
         </w:rPr>
-        <w:t xml:space="preserve">Agent quality varies, and incentives make it worse. </w:t>
+        <w:t xml:space="preserve">Intent is judged by gut. </w:t>
       </w:r>
       <w:r>
         <w:rPr>
@@ -823,7 +726,7 @@
           <w:sz w:val="16"/>
           <w:szCs w:val="16"/>
         </w:rPr>
-        <w:t xml:space="preserve">It varies between agents and within one agent across a shift. Only 10–20% of calls are reviewed, and agents are paid on promises logged rather than promises kept, so a soft promise counts the same as a real one.</w:t>
+        <w:t xml:space="preserve">About 30% of non-payers have an intent problem and 70% a genuine one (medical, salary delay, family), but there is no fixed rule and it varies by agent and region. The record is a one-word disposition.</w:t>
       </w:r>
     </w:p>
     <w:p>
@@ -845,7 +748,7 @@
           <w:sz w:val="17"/>
           <w:szCs w:val="17"/>
         </w:rPr>
-        <w:t xml:space="preserve">The record captures fields, not signals. </w:t>
+        <w:t xml:space="preserve">Quality is sampled. </w:t>
       </w:r>
       <w:r>
         <w:rPr>
@@ -854,7 +757,7 @@
           <w:sz w:val="16"/>
           <w:szCs w:val="16"/>
         </w:rPr>
-        <w:t xml:space="preserve">An agent marks a disposition and a date. Tone, how firmly the borrower committed and the words they chose — the things that predict whether a promise holds — are never written down, so nothing can learn from them.</w:t>
+        <w:t xml:space="preserve">A quality team hears 10–20% of calls. An LLM now scores all of them, and its dispositions match the agents' about 80% of the time.</w:t>
       </w:r>
     </w:p>
     <w:p>
@@ -876,7 +779,7 @@
           <w:sz w:val="17"/>
           <w:szCs w:val="17"/>
         </w:rPr>
-        <w:t xml:space="preserve">The signals that do exist sit in separate systems. </w:t>
+        <w:t xml:space="preserve">The bot already works; the decision does not. </w:t>
       </w:r>
       <w:r>
         <w:rPr>
@@ -885,7 +788,7 @@
           <w:sz w:val="16"/>
           <w:szCs w:val="16"/>
         </w:rPr>
-        <w:t xml:space="preserve">Communication behaviour, call history and the credit profile live in different tools. Few lenders triangulate them into one view of intent and one next step.</w:t>
+        <w:t xml:space="preserve">AI calling cut cost from ₹11 to ₹3–4 a minute and matched humans in an A/B test. What is still unbuilt: choosing which borrower goes to a person, and using the last call to shape the next.</w:t>
       </w:r>
     </w:p>
     <w:p>
@@ -934,7 +837,7 @@
           <w:sz w:val="17"/>
           <w:szCs w:val="17"/>
         </w:rPr>
-        <w:t xml:space="preserve">The Razorpay Trusted Collections Agent reaches the borrower while the bounce is hours old, not days.</w:t>
+        <w:t xml:space="preserve">The Razorpay Trusted Collections Agent reaches the borrower while the bounce is hours old.</w:t>
       </w:r>
     </w:p>
     <w:p>
@@ -956,16 +859,16 @@
           <w:sz w:val="17"/>
           <w:szCs w:val="17"/>
         </w:rPr>
-        <w:t xml:space="preserve">Negotiates like a good agent. </w:t>
-      </w:r>
-      <w:r>
-        <w:rPr>
-          <w:rFonts w:ascii="Calibri" w:cs="Calibri" w:eastAsia="Calibri" w:hAnsi="Calibri"/>
-          <w:color w:val="11243A"/>
-          <w:sz w:val="17"/>
-          <w:szCs w:val="17"/>
-        </w:rPr>
-        <w:t xml:space="preserve">Asks why the EMI missed and listens, then proposes a date that fits when the borrower is actually paid, and asks for a promise with a date and an amount.</w:t>
+        <w:t xml:space="preserve">Negotiates like a good agent, inside the lender's rules. </w:t>
+      </w:r>
+      <w:r>
+        <w:rPr>
+          <w:rFonts w:ascii="Calibri" w:cs="Calibri" w:eastAsia="Calibri" w:hAnsi="Calibri"/>
+          <w:color w:val="11243A"/>
+          <w:sz w:val="17"/>
+          <w:szCs w:val="17"/>
+        </w:rPr>
+        <w:t xml:space="preserve">Identity first, asks why and listens, proposes a date that fits payday, one payment link, a ticket instead of a promise it cannot make.</w:t>
       </w:r>
     </w:p>
     <w:p>
@@ -987,16 +890,34 @@
           <w:sz w:val="17"/>
           <w:szCs w:val="17"/>
         </w:rPr>
-        <w:t xml:space="preserve">Stays inside the lender's rules. </w:t>
-      </w:r>
-      <w:r>
-        <w:rPr>
-          <w:rFonts w:ascii="Calibri" w:cs="Calibri" w:eastAsia="Calibri" w:hAnsi="Calibri"/>
-          <w:color w:val="11243A"/>
-          <w:sz w:val="17"/>
-          <w:szCs w:val="17"/>
-        </w:rPr>
-        <w:t xml:space="preserve">Identity first, the lender's facts only, exactly one payment link, and a ticket instead of a promise it has no authority to make, such as waiving a charge.</w:t>
+        <w:t xml:space="preserve">Turns the call into signals and recommends the next step. </w:t>
+      </w:r>
+      <w:r>
+        <w:rPr>
+          <w:rFonts w:ascii="Calibri" w:cs="Calibri" w:eastAsia="Calibri" w:hAnsi="Calibri"/>
+          <w:color w:val="11243A"/>
+          <w:sz w:val="17"/>
+          <w:szCs w:val="17"/>
+        </w:rPr>
+        <w:t xml:space="preserve">Reason, tone and promise specificity plus the borrower's history give one route: keep the AI, or hand to a person. The demo borrower makes the point: a firm promise, yet four bounces in six months send him to a person.</w:t>
+      </w:r>
+    </w:p>
+    <w:p>
+      <w:pPr>
+        <w:spacing w:after="45" w:before="105"/>
+      </w:pPr>
+      <w:r>
+        <w:rPr>
+          <w:rFonts w:ascii="Calibri" w:cs="Calibri" w:eastAsia="Calibri" w:hAnsi="Calibri"/>
+          <w:b/>
+          <w:bCs/>
+          <w:caps/>
+          <w:color w:val="1A4FD6"/>
+          <w:spacing w:val="20"/>
+          <w:sz w:val="18"/>
+          <w:szCs w:val="18"/>
+        </w:rPr>
+        <w:t xml:space="preserve">Key product and AI decisions</w:t>
       </w:r>
     </w:p>
     <w:p>
@@ -1018,16 +939,16 @@
           <w:sz w:val="17"/>
           <w:szCs w:val="17"/>
         </w:rPr>
-        <w:t xml:space="preserve">Turns the call into signals. </w:t>
-      </w:r>
-      <w:r>
-        <w:rPr>
-          <w:rFonts w:ascii="Calibri" w:cs="Calibri" w:eastAsia="Calibri" w:hAnsi="Calibri"/>
-          <w:color w:val="11243A"/>
-          <w:sz w:val="17"/>
-          <w:szCs w:val="17"/>
-        </w:rPr>
-        <w:t xml:space="preserve">Reason, root cause, tone, cooperation and promise specificity — on every call, with the transcript scored against every rule.</w:t>
+        <w:t xml:space="preserve">Two questions decide the route. </w:t>
+      </w:r>
+      <w:r>
+        <w:rPr>
+          <w:rFonts w:ascii="Calibri" w:cs="Calibri" w:eastAsia="Calibri" w:hAnsi="Calibri"/>
+          <w:color w:val="11243A"/>
+          <w:sz w:val="17"/>
+          <w:szCs w:val="17"/>
+        </w:rPr>
+        <w:t xml:space="preserve">Has intent shifted (four or more bounces in the window)? Did the AI let the borrower down on this call? Either yes sends the borrower to a person. Two questions fit on a screen and match how the lender's team described judging intent.</w:t>
       </w:r>
     </w:p>
     <w:p>
@@ -1049,34 +970,16 @@
           <w:sz w:val="17"/>
           <w:szCs w:val="17"/>
         </w:rPr>
-        <w:t xml:space="preserve">Recommends the next step. </w:t>
-      </w:r>
-      <w:r>
-        <w:rPr>
-          <w:rFonts w:ascii="Calibri" w:cs="Calibri" w:eastAsia="Calibri" w:hAnsi="Calibri"/>
-          <w:color w:val="11243A"/>
-          <w:sz w:val="17"/>
-          <w:szCs w:val="17"/>
-        </w:rPr>
-        <w:t xml:space="preserve">Call signals plus the borrower's history produce one route: keep dialling with the AI, hand to a human agent, or move to field collection. Rules decide and can be read aloud; the model only extracts facts. The demo borrower proves it — a firm promise, yet four bounces in six months hand him to a person before he breaks another.</w:t>
-      </w:r>
-    </w:p>
-    <w:p>
-      <w:pPr>
-        <w:spacing w:after="45" w:before="105"/>
-      </w:pPr>
-      <w:r>
-        <w:rPr>
-          <w:rFonts w:ascii="Calibri" w:cs="Calibri" w:eastAsia="Calibri" w:hAnsi="Calibri"/>
-          <w:b/>
-          <w:bCs/>
-          <w:caps/>
-          <w:color w:val="1A4FD6"/>
-          <w:spacing w:val="20"/>
-          <w:sz w:val="18"/>
-          <w:szCs w:val="18"/>
-        </w:rPr>
-        <w:t xml:space="preserve">Why this fits Razorpay</w:t>
+        <w:t xml:space="preserve">Rules route; the model never does. </w:t>
+      </w:r>
+      <w:r>
+        <w:rPr>
+          <w:rFonts w:ascii="Calibri" w:cs="Calibri" w:eastAsia="Calibri" w:hAnsi="Calibri"/>
+          <w:color w:val="11243A"/>
+          <w:sz w:val="17"/>
+          <w:szCs w:val="17"/>
+        </w:rPr>
+        <w:t xml:space="preserve">The model only extracts facts (reason, promise, tone). Fixed, readable rules decide, so every route can be explained and a threshold is a one-line edit in a content file.</w:t>
       </w:r>
     </w:p>
     <w:p>
@@ -1098,16 +1001,34 @@
           <w:sz w:val="17"/>
           <w:szCs w:val="17"/>
         </w:rPr>
-        <w:t xml:space="preserve">Razorpay already runs the mandate that bounced. </w:t>
-      </w:r>
-      <w:r>
-        <w:rPr>
-          <w:rFonts w:ascii="Calibri" w:cs="Calibri" w:eastAsia="Calibri" w:hAnsi="Calibri"/>
-          <w:color w:val="11243A"/>
-          <w:sz w:val="17"/>
-          <w:szCs w:val="17"/>
-        </w:rPr>
-        <w:t xml:space="preserve">e-NACH and UPI Autopay for NBFCs sit behind one Razorpay API, and a failed debit already fires a webhook — the exact trigger this agent needs. No new integration to know who to call, or when.</w:t>
+        <w:t xml:space="preserve">Every call is checked twice. </w:t>
+      </w:r>
+      <w:r>
+        <w:rPr>
+          <w:rFonts w:ascii="Calibri" w:cs="Calibri" w:eastAsia="Calibri" w:hAnsi="Calibri"/>
+          <w:color w:val="11243A"/>
+          <w:sz w:val="17"/>
+          <w:szCs w:val="17"/>
+        </w:rPr>
+        <w:t xml:space="preserve">A model review plus exact checks in code; a flag from either counts as a breach. No waiver or unapproved promise is ever made; a ticket is raised instead.</w:t>
+      </w:r>
+    </w:p>
+    <w:p>
+      <w:pPr>
+        <w:spacing w:after="45" w:before="105"/>
+      </w:pPr>
+      <w:r>
+        <w:rPr>
+          <w:rFonts w:ascii="Calibri" w:cs="Calibri" w:eastAsia="Calibri" w:hAnsi="Calibri"/>
+          <w:b/>
+          <w:bCs/>
+          <w:caps/>
+          <w:color w:val="1A4FD6"/>
+          <w:spacing w:val="20"/>
+          <w:sz w:val="18"/>
+          <w:szCs w:val="18"/>
+        </w:rPr>
+        <w:t xml:space="preserve">Deliberately left out</w:t>
       </w:r>
     </w:p>
     <w:p>
@@ -1123,22 +1044,29 @@
       <w:r>
         <w:rPr>
           <w:rFonts w:ascii="Calibri" w:cs="Calibri" w:eastAsia="Calibri" w:hAnsi="Calibri"/>
-          <w:b/>
-          <w:bCs/>
-          <w:color w:val="11243A"/>
-          <w:sz w:val="17"/>
-          <w:szCs w:val="17"/>
-        </w:rPr>
-        <w:t xml:space="preserve">The bounce and the cure live on the same rails. </w:t>
-      </w:r>
-      <w:r>
-        <w:rPr>
-          <w:rFonts w:ascii="Calibri" w:cs="Calibri" w:eastAsia="Calibri" w:hAnsi="Calibri"/>
-          <w:color w:val="11243A"/>
-          <w:sz w:val="17"/>
-          <w:szCs w:val="17"/>
-        </w:rPr>
-        <w:t xml:space="preserve">The link the agent sends is a Razorpay link, so the money and the measurement land in one place.</w:t>
+          <w:color w:val="11243A"/>
+          <w:sz w:val="16"/>
+          <w:szCs w:val="16"/>
+        </w:rPr>
+        <w:t xml:space="preserve">No approve-or-override workflow, so the manager sees the route and the reason, not another queue. No field-visit model: the sample never triggers it and I did not invent one. No channel or timing optimisation. No bureau or bank data: one call plus the lender's own history. India-only numbers, no global benchmarks.</w:t>
+      </w:r>
+    </w:p>
+    <w:p>
+      <w:pPr>
+        <w:spacing w:after="45" w:before="105"/>
+      </w:pPr>
+      <w:r>
+        <w:rPr>
+          <w:rFonts w:ascii="Calibri" w:cs="Calibri" w:eastAsia="Calibri" w:hAnsi="Calibri"/>
+          <w:b/>
+          <w:bCs/>
+          <w:caps/>
+          <w:color w:val="1A4FD6"/>
+          <w:spacing w:val="20"/>
+          <w:sz w:val="18"/>
+          <w:szCs w:val="18"/>
+        </w:rPr>
+        <w:t xml:space="preserve">Why Razorpay</w:t>
       </w:r>
     </w:p>
     <w:p>
@@ -1160,16 +1088,16 @@
           <w:sz w:val="17"/>
           <w:szCs w:val="17"/>
         </w:rPr>
-        <w:t xml:space="preserve">It turns a payments product into an outcome. </w:t>
-      </w:r>
-      <w:r>
-        <w:rPr>
-          <w:rFonts w:ascii="Calibri" w:cs="Calibri" w:eastAsia="Calibri" w:hAnsi="Calibri"/>
-          <w:color w:val="11243A"/>
-          <w:sz w:val="17"/>
-          <w:szCs w:val="17"/>
-        </w:rPr>
-        <w:t xml:space="preserve">Lenders buy mandate infrastructure today; this sells rupees recovered on the same plumbing, priced against ₹11-a-minute human calling.</w:t>
+        <w:t xml:space="preserve">It already runs the mandate that bounced. </w:t>
+      </w:r>
+      <w:r>
+        <w:rPr>
+          <w:rFonts w:ascii="Calibri" w:cs="Calibri" w:eastAsia="Calibri" w:hAnsi="Calibri"/>
+          <w:color w:val="11243A"/>
+          <w:sz w:val="17"/>
+          <w:szCs w:val="17"/>
+        </w:rPr>
+        <w:t xml:space="preserve">A failed debit already fires a webhook, which is the trigger this agent needs, and the payment link and the measurement land on the same rails.</w:t>
       </w:r>
     </w:p>
     <w:p>
@@ -1191,16 +1119,16 @@
           <w:sz w:val="17"/>
           <w:szCs w:val="17"/>
         </w:rPr>
-        <w:t xml:space="preserve">Compliance and scale both favour the aggregator. </w:t>
-      </w:r>
-      <w:r>
-        <w:rPr>
-          <w:rFonts w:ascii="Calibri" w:cs="Calibri" w:eastAsia="Calibri" w:hAnsi="Calibri"/>
-          <w:color w:val="11243A"/>
-          <w:sz w:val="17"/>
-          <w:szCs w:val="17"/>
-        </w:rPr>
-        <w:t xml:space="preserve">An RBI-authorised payment aggregator is better placed than a point vendor to run recorded, rule-scored calls under the RBI recovery directions of August 2026 — and bounce outcomes seen across many lenders calibrate the routing better than any single book can.</w:t>
+        <w:t xml:space="preserve">It sells an outcome, not plumbing. </w:t>
+      </w:r>
+      <w:r>
+        <w:rPr>
+          <w:rFonts w:ascii="Calibri" w:cs="Calibri" w:eastAsia="Calibri" w:hAnsi="Calibri"/>
+          <w:color w:val="11243A"/>
+          <w:sz w:val="17"/>
+          <w:szCs w:val="17"/>
+        </w:rPr>
+        <w:t xml:space="preserve">Rupees recovered, priced against ₹11-a-minute human calling, under a regulated aggregator's recorded, rule-scored calls.</w:t>
       </w:r>
     </w:p>
     <w:p>
@@ -1218,7 +1146,7 @@
           <w:sz w:val="18"/>
           <w:szCs w:val="18"/>
         </w:rPr>
-        <w:t xml:space="preserve">Success metrics</w:t>
+        <w:t xml:space="preserve">Success metric and what to test next</w:t>
       </w:r>
     </w:p>
     <w:tbl>
@@ -1378,7 +1306,7 @@
                 <w:sz w:val="15"/>
                 <w:szCs w:val="15"/>
               </w:rPr>
-              <w:t xml:space="preserve">Payment collected</w:t>
+              <w:t xml:space="preserve">PRIMARY: payment collected</w:t>
             </w:r>
           </w:p>
         </w:tc>
@@ -1411,7 +1339,7 @@
                 <w:sz w:val="15"/>
                 <w:szCs w:val="15"/>
               </w:rPr>
-              <w:t xml:space="preserve">Rupees recovered of rupees targeted</w:t>
+              <w:t xml:space="preserve">Rupees recovered of rupees due</w:t>
             </w:r>
           </w:p>
         </w:tc>
@@ -1548,7 +1476,7 @@
                 <w:sz w:val="15"/>
                 <w:szCs w:val="15"/>
               </w:rPr>
-              <w:t xml:space="preserve">40 of 100 EMIs · 5 days median</w:t>
+              <w:t xml:space="preserve">40 of 100 · 5 days median</w:t>
             </w:r>
           </w:p>
         </w:tc>
@@ -1586,7 +1514,7 @@
                 <w:sz w:val="15"/>
                 <w:szCs w:val="15"/>
               </w:rPr>
-              <w:t xml:space="preserve">Promise and reason capture</w:t>
+              <w:t xml:space="preserve">Hard-rule breach rate</w:t>
             </w:r>
           </w:p>
         </w:tc>
@@ -1619,7 +1547,7 @@
                 <w:sz w:val="15"/>
                 <w:szCs w:val="15"/>
               </w:rPr>
-              <w:t xml:space="preserve">Calls ending in a dated promise, and in a clear reason</w:t>
+              <w:t xml:space="preserve">Compliance; the target is zero</w:t>
             </w:r>
           </w:p>
         </w:tc>
@@ -1652,7 +1580,7 @@
                 <w:sz w:val="15"/>
                 <w:szCs w:val="15"/>
               </w:rPr>
-              <w:t xml:space="preserve">63.9% and 92.8% of conversations</w:t>
+              <w:t xml:space="preserve">29.7% — the gap to close first</w:t>
             </w:r>
           </w:p>
         </w:tc>
@@ -1756,215 +1684,7 @@
                 <w:sz w:val="15"/>
                 <w:szCs w:val="15"/>
               </w:rPr>
-              <w:t xml:space="preserve">Not yet measured — needs live calls</w:t>
-            </w:r>
-          </w:p>
-        </w:tc>
-      </w:tr>
-      <w:tr>
-        <w:trPr>
-          <w:tblHeader w:val="false"/>
-        </w:trPr>
-        <w:tc>
-          <w:tcPr>
-            <w:tcW w:type="dxa" w:w="2450"/>
-            <w:tcBorders>
-              <w:top w:val="single" w:color="C9D2E0" w:sz="2"/>
-              <w:left w:val="none" w:color="FFFFFF" w:sz="0"/>
-              <w:bottom w:val="single" w:color="C9D2E0" w:sz="2"/>
-              <w:right w:val="none" w:color="FFFFFF" w:sz="0"/>
-            </w:tcBorders>
-            <w:tcMar>
-              <w:top w:type="dxa" w:w="40"/>
-              <w:left w:type="dxa" w:w="85"/>
-              <w:bottom w:type="dxa" w:w="40"/>
-              <w:right w:type="dxa" w:w="85"/>
-            </w:tcMar>
-          </w:tcPr>
-          <w:p>
-            <w:pPr>
-              <w:spacing w:after="0" w:line="205"/>
-            </w:pPr>
-            <w:r>
-              <w:rPr>
-                <w:rFonts w:ascii="Calibri" w:cs="Calibri" w:eastAsia="Calibri" w:hAnsi="Calibri"/>
-                <w:b w:val="false"/>
-                <w:bCs w:val="false"/>
-                <w:color w:val="11243A"/>
-                <w:sz w:val="15"/>
-                <w:szCs w:val="15"/>
-              </w:rPr>
-              <w:t xml:space="preserve">Hard-rule breach rate</w:t>
-            </w:r>
-          </w:p>
-        </w:tc>
-        <w:tc>
-          <w:tcPr>
-            <w:tcW w:type="dxa" w:w="3550"/>
-            <w:tcBorders>
-              <w:top w:val="single" w:color="C9D2E0" w:sz="2"/>
-              <w:left w:val="none" w:color="FFFFFF" w:sz="0"/>
-              <w:bottom w:val="single" w:color="C9D2E0" w:sz="2"/>
-              <w:right w:val="none" w:color="FFFFFF" w:sz="0"/>
-            </w:tcBorders>
-            <w:tcMar>
-              <w:top w:type="dxa" w:w="40"/>
-              <w:left w:type="dxa" w:w="85"/>
-              <w:bottom w:type="dxa" w:w="40"/>
-              <w:right w:type="dxa" w:w="85"/>
-            </w:tcMar>
-          </w:tcPr>
-          <w:p>
-            <w:pPr>
-              <w:spacing w:after="0" w:line="205"/>
-            </w:pPr>
-            <w:r>
-              <w:rPr>
-                <w:rFonts w:ascii="Calibri" w:cs="Calibri" w:eastAsia="Calibri" w:hAnsi="Calibri"/>
-                <w:b w:val="false"/>
-                <w:bCs w:val="false"/>
-                <w:color w:val="5B6B85"/>
-                <w:sz w:val="15"/>
-                <w:szCs w:val="15"/>
-              </w:rPr>
-              <w:t xml:space="preserve">Compliance; the target is zero</w:t>
-            </w:r>
-          </w:p>
-        </w:tc>
-        <w:tc>
-          <w:tcPr>
-            <w:tcW w:type="dxa" w:w="3240"/>
-            <w:tcBorders>
-              <w:top w:val="single" w:color="C9D2E0" w:sz="2"/>
-              <w:left w:val="none" w:color="FFFFFF" w:sz="0"/>
-              <w:bottom w:val="single" w:color="C9D2E0" w:sz="2"/>
-              <w:right w:val="none" w:color="FFFFFF" w:sz="0"/>
-            </w:tcBorders>
-            <w:tcMar>
-              <w:top w:type="dxa" w:w="40"/>
-              <w:left w:type="dxa" w:w="85"/>
-              <w:bottom w:type="dxa" w:w="40"/>
-              <w:right w:type="dxa" w:w="85"/>
-            </w:tcMar>
-          </w:tcPr>
-          <w:p>
-            <w:pPr>
-              <w:spacing w:after="0" w:line="205"/>
-            </w:pPr>
-            <w:r>
-              <w:rPr>
-                <w:rFonts w:ascii="Calibri" w:cs="Calibri" w:eastAsia="Calibri" w:hAnsi="Calibri"/>
-                <w:b w:val="false"/>
-                <w:bCs w:val="false"/>
-                <w:color w:val="5B6B85"/>
-                <w:sz w:val="15"/>
-                <w:szCs w:val="15"/>
-              </w:rPr>
-              <w:t xml:space="preserve">29.7% — the gap to close first</w:t>
-            </w:r>
-          </w:p>
-        </w:tc>
-      </w:tr>
-      <w:tr>
-        <w:trPr>
-          <w:tblHeader w:val="false"/>
-        </w:trPr>
-        <w:tc>
-          <w:tcPr>
-            <w:tcW w:type="dxa" w:w="2450"/>
-            <w:tcBorders>
-              <w:top w:val="single" w:color="C9D2E0" w:sz="2"/>
-              <w:left w:val="none" w:color="FFFFFF" w:sz="0"/>
-              <w:bottom w:val="single" w:color="C9D2E0" w:sz="2"/>
-              <w:right w:val="none" w:color="FFFFFF" w:sz="0"/>
-            </w:tcBorders>
-            <w:tcMar>
-              <w:top w:type="dxa" w:w="40"/>
-              <w:left w:type="dxa" w:w="85"/>
-              <w:bottom w:type="dxa" w:w="40"/>
-              <w:right w:type="dxa" w:w="85"/>
-            </w:tcMar>
-          </w:tcPr>
-          <w:p>
-            <w:pPr>
-              <w:spacing w:after="0" w:line="205"/>
-            </w:pPr>
-            <w:r>
-              <w:rPr>
-                <w:rFonts w:ascii="Calibri" w:cs="Calibri" w:eastAsia="Calibri" w:hAnsi="Calibri"/>
-                <w:b w:val="false"/>
-                <w:bCs w:val="false"/>
-                <w:color w:val="11243A"/>
-                <w:sz w:val="15"/>
-                <w:szCs w:val="15"/>
-              </w:rPr>
-              <w:t xml:space="preserve">Cost per contact</w:t>
-            </w:r>
-          </w:p>
-        </w:tc>
-        <w:tc>
-          <w:tcPr>
-            <w:tcW w:type="dxa" w:w="3550"/>
-            <w:tcBorders>
-              <w:top w:val="single" w:color="C9D2E0" w:sz="2"/>
-              <w:left w:val="none" w:color="FFFFFF" w:sz="0"/>
-              <w:bottom w:val="single" w:color="C9D2E0" w:sz="2"/>
-              <w:right w:val="none" w:color="FFFFFF" w:sz="0"/>
-            </w:tcBorders>
-            <w:tcMar>
-              <w:top w:type="dxa" w:w="40"/>
-              <w:left w:type="dxa" w:w="85"/>
-              <w:bottom w:type="dxa" w:w="40"/>
-              <w:right w:type="dxa" w:w="85"/>
-            </w:tcMar>
-          </w:tcPr>
-          <w:p>
-            <w:pPr>
-              <w:spacing w:after="0" w:line="205"/>
-            </w:pPr>
-            <w:r>
-              <w:rPr>
-                <w:rFonts w:ascii="Calibri" w:cs="Calibri" w:eastAsia="Calibri" w:hAnsi="Calibri"/>
-                <w:b w:val="false"/>
-                <w:bCs w:val="false"/>
-                <w:color w:val="5B6B85"/>
-                <w:sz w:val="15"/>
-                <w:szCs w:val="15"/>
-              </w:rPr>
-              <w:t xml:space="preserve">Cost of reaching one borrower</w:t>
-            </w:r>
-          </w:p>
-        </w:tc>
-        <w:tc>
-          <w:tcPr>
-            <w:tcW w:type="dxa" w:w="3240"/>
-            <w:tcBorders>
-              <w:top w:val="single" w:color="C9D2E0" w:sz="2"/>
-              <w:left w:val="none" w:color="FFFFFF" w:sz="0"/>
-              <w:bottom w:val="single" w:color="C9D2E0" w:sz="2"/>
-              <w:right w:val="none" w:color="FFFFFF" w:sz="0"/>
-            </w:tcBorders>
-            <w:tcMar>
-              <w:top w:type="dxa" w:w="40"/>
-              <w:left w:type="dxa" w:w="85"/>
-              <w:bottom w:type="dxa" w:w="40"/>
-              <w:right w:type="dxa" w:w="85"/>
-            </w:tcMar>
-          </w:tcPr>
-          <w:p>
-            <w:pPr>
-              <w:spacing w:after="0" w:line="205"/>
-            </w:pPr>
-            <w:r>
-              <w:rPr>
-                <w:rFonts w:ascii="Calibri" w:cs="Calibri" w:eastAsia="Calibri" w:hAnsi="Calibri"/>
-                <w:b w:val="false"/>
-                <w:bCs w:val="false"/>
-                <w:color w:val="5B6B85"/>
-                <w:sz w:val="15"/>
-                <w:szCs w:val="15"/>
-              </w:rPr>
-              <w:t xml:space="preserve">₹10.50 by AI vs ₹55 by a person</w:t>
+              <w:t xml:space="preserve">Not yet measured; needs live calls</w:t>
             </w:r>
           </w:p>
         </w:tc>
@@ -1974,6 +1694,17 @@
       <w:pPr>
         <w:spacing w:before="55"/>
       </w:pPr>
+      <w:r>
+        <w:rPr>
+          <w:rFonts w:ascii="Calibri" w:cs="Calibri" w:eastAsia="Calibri" w:hAnsi="Calibri"/>
+          <w:b/>
+          <w:bCs/>
+          <w:color w:val="11243A"/>
+          <w:sz w:val="17"/>
+          <w:szCs w:val="17"/>
+        </w:rPr>
+        <w:t xml:space="preserve">Next test: </w:t>
+      </w:r>
       <w:r>
         <w:rPr>
           <w:rFonts w:ascii="Calibri" w:cs="Calibri" w:eastAsia="Calibri" w:hAnsi="Calibri"/>
@@ -1981,7 +1712,7 @@
           <w:sz w:val="15"/>
           <w:szCs w:val="15"/>
         </w:rPr>
-        <w:t xml:space="preserve">Not yet built: the recommendation is shown but not executed, weights are uncalibrated because nothing records whether a promise was kept, and the demo routes between AI and a person only.</w:t>
+        <w:t xml:space="preserve">split one month's bounced EMIs, half through the agent and its routing and half through today's process, and compare rupees collected in nine days and whether routed-to-person cases recover more than if left with the AI. Sample figures are synthetic; weights are uncalibrated and the recommendation is shown, not executed.</w:t>
       </w:r>
     </w:p>
     <w:sectPr>

</xml_diff>

<commit_message>
Product note: planning as a decision, hard vs judgement rules, deliberate exclusions
Co-Authored-By: Claude Sonnet 5.5 <noreply@anthropic.com>
Claude-Session: https://claude.ai/code/session_01UkYraoXMEPqUCAeqnCcg3Y
</commit_message>
<xml_diff>
--- a/note/product-note.docx
+++ b/note/product-note.docx
@@ -29,7 +29,7 @@
           <w:sz w:val="18"/>
           <w:szCs w:val="18"/>
         </w:rPr>
-        <w:t xml:space="preserve">A Hindi voice agent for bounced personal-loan EMIs: it holds the call, then recommends whether the AI or a person takes the borrower next.</w:t>
+        <w:t xml:space="preserve">A Hindi voice agent for bounced EMIs that recommends who takes the borrower next: the AI or a person.</w:t>
       </w:r>
     </w:p>
     <w:p>
@@ -530,110 +530,6 @@
           </w:p>
         </w:tc>
       </w:tr>
-      <w:tr>
-        <w:trPr>
-          <w:tblHeader w:val="false"/>
-        </w:trPr>
-        <w:tc>
-          <w:tcPr>
-            <w:tcW w:type="dxa" w:w="2750"/>
-            <w:tcBorders>
-              <w:top w:val="single" w:color="C9D2E0" w:sz="2"/>
-              <w:left w:val="none" w:color="FFFFFF" w:sz="0"/>
-              <w:bottom w:val="single" w:color="C9D2E0" w:sz="2"/>
-              <w:right w:val="none" w:color="FFFFFF" w:sz="0"/>
-            </w:tcBorders>
-            <w:tcMar>
-              <w:top w:type="dxa" w:w="40"/>
-              <w:left w:type="dxa" w:w="85"/>
-              <w:bottom w:type="dxa" w:w="40"/>
-              <w:right w:type="dxa" w:w="85"/>
-            </w:tcMar>
-          </w:tcPr>
-          <w:p>
-            <w:pPr>
-              <w:spacing w:after="0" w:line="205"/>
-            </w:pPr>
-            <w:r>
-              <w:rPr>
-                <w:rFonts w:ascii="Calibri" w:cs="Calibri" w:eastAsia="Calibri" w:hAnsi="Calibri"/>
-                <w:b w:val="false"/>
-                <w:bCs w:val="false"/>
-                <w:color w:val="11243A"/>
-                <w:sz w:val="15"/>
-                <w:szCs w:val="15"/>
-              </w:rPr>
-              <w:t xml:space="preserve">What chasing it costs</w:t>
-            </w:r>
-          </w:p>
-        </w:tc>
-        <w:tc>
-          <w:tcPr>
-            <w:tcW w:type="dxa" w:w="4100"/>
-            <w:tcBorders>
-              <w:top w:val="single" w:color="C9D2E0" w:sz="2"/>
-              <w:left w:val="none" w:color="FFFFFF" w:sz="0"/>
-              <w:bottom w:val="single" w:color="C9D2E0" w:sz="2"/>
-              <w:right w:val="none" w:color="FFFFFF" w:sz="0"/>
-            </w:tcBorders>
-            <w:tcMar>
-              <w:top w:type="dxa" w:w="40"/>
-              <w:left w:type="dxa" w:w="85"/>
-              <w:bottom w:type="dxa" w:w="40"/>
-              <w:right w:type="dxa" w:w="85"/>
-            </w:tcMar>
-          </w:tcPr>
-          <w:p>
-            <w:pPr>
-              <w:spacing w:after="0" w:line="205"/>
-            </w:pPr>
-            <w:r>
-              <w:rPr>
-                <w:rFonts w:ascii="Calibri" w:cs="Calibri" w:eastAsia="Calibri" w:hAnsi="Calibri"/>
-                <w:b w:val="false"/>
-                <w:bCs w:val="false"/>
-                <w:color w:val="5B6B85"/>
-                <w:sz w:val="15"/>
-                <w:szCs w:val="15"/>
-              </w:rPr>
-              <w:t xml:space="preserve">₹11 a minute of human calling; one caller covers ~400 borrowers</w:t>
-            </w:r>
-          </w:p>
-        </w:tc>
-        <w:tc>
-          <w:tcPr>
-            <w:tcW w:type="dxa" w:w="2390"/>
-            <w:tcBorders>
-              <w:top w:val="single" w:color="C9D2E0" w:sz="2"/>
-              <w:left w:val="none" w:color="FFFFFF" w:sz="0"/>
-              <w:bottom w:val="single" w:color="C9D2E0" w:sz="2"/>
-              <w:right w:val="none" w:color="FFFFFF" w:sz="0"/>
-            </w:tcBorders>
-            <w:tcMar>
-              <w:top w:type="dxa" w:w="40"/>
-              <w:left w:type="dxa" w:w="85"/>
-              <w:bottom w:type="dxa" w:w="40"/>
-              <w:right w:type="dxa" w:w="85"/>
-            </w:tcMar>
-          </w:tcPr>
-          <w:p>
-            <w:pPr>
-              <w:spacing w:after="0" w:line="205"/>
-            </w:pPr>
-            <w:r>
-              <w:rPr>
-                <w:rFonts w:ascii="Calibri" w:cs="Calibri" w:eastAsia="Calibri" w:hAnsi="Calibri"/>
-                <w:b w:val="false"/>
-                <w:bCs w:val="false"/>
-                <w:color w:val="5B6B85"/>
-                <w:sz w:val="15"/>
-                <w:szCs w:val="15"/>
-              </w:rPr>
-              <w:t xml:space="preserve">Lender interviews</w:t>
-            </w:r>
-          </w:p>
-        </w:tc>
-      </w:tr>
     </w:tbl>
     <w:p>
       <w:pPr>
@@ -890,7 +786,7 @@
           <w:sz w:val="17"/>
           <w:szCs w:val="17"/>
         </w:rPr>
-        <w:t xml:space="preserve">Turns the call into signals and recommends the next step. </w:t>
+        <w:t xml:space="preserve">Turns the call into signals, then recommends and plans the next step. </w:t>
       </w:r>
       <w:r>
         <w:rPr>
@@ -939,16 +835,16 @@
           <w:sz w:val="17"/>
           <w:szCs w:val="17"/>
         </w:rPr>
-        <w:t xml:space="preserve">Two questions decide the route. </w:t>
-      </w:r>
-      <w:r>
-        <w:rPr>
-          <w:rFonts w:ascii="Calibri" w:cs="Calibri" w:eastAsia="Calibri" w:hAnsi="Calibri"/>
-          <w:color w:val="11243A"/>
-          <w:sz w:val="17"/>
-          <w:szCs w:val="17"/>
-        </w:rPr>
-        <w:t xml:space="preserve">Has intent shifted (four or more bounces in the window)? Did the AI let the borrower down on this call? Either yes sends the borrower to a person. Two questions fit on a screen and match how the lender's team described judging intent.</w:t>
+        <w:t xml:space="preserve">The product ends in a plan, not a recommendation. </w:t>
+      </w:r>
+      <w:r>
+        <w:rPr>
+          <w:rFonts w:ascii="Calibri" w:cs="Calibri" w:eastAsia="Calibri" w:hAnsi="Calibri"/>
+          <w:color w:val="11243A"/>
+          <w:sz w:val="17"/>
+          <w:szCs w:val="17"/>
+        </w:rPr>
+        <w:t xml:space="preserve">A route for one borrower does not change collections. The Plan tab turns the routes into resource allocation for the cycle: how many AI calls, person calls and reminders, how much lands by day 1, 3 and 7, and where the gap to target sits (the agent, our callers, or where effort goes).</w:t>
       </w:r>
     </w:p>
     <w:p>
@@ -970,16 +866,16 @@
           <w:sz w:val="17"/>
           <w:szCs w:val="17"/>
         </w:rPr>
-        <w:t xml:space="preserve">Rules route; the model never does. </w:t>
-      </w:r>
-      <w:r>
-        <w:rPr>
-          <w:rFonts w:ascii="Calibri" w:cs="Calibri" w:eastAsia="Calibri" w:hAnsi="Calibri"/>
-          <w:color w:val="11243A"/>
-          <w:sz w:val="17"/>
-          <w:szCs w:val="17"/>
-        </w:rPr>
-        <w:t xml:space="preserve">The model only extracts facts (reason, promise, tone). Fixed, readable rules decide, so every route can be explained and a threshold is a one-line edit in a content file.</w:t>
+        <w:t xml:space="preserve">Two questions decide the route, and rules decide, not the model. </w:t>
+      </w:r>
+      <w:r>
+        <w:rPr>
+          <w:rFonts w:ascii="Calibri" w:cs="Calibri" w:eastAsia="Calibri" w:hAnsi="Calibri"/>
+          <w:color w:val="11243A"/>
+          <w:sz w:val="17"/>
+          <w:szCs w:val="17"/>
+        </w:rPr>
+        <w:t xml:space="preserve">Has intent shifted (four or more bounces in the window)? Did the AI let the borrower down on this call? Either yes sends the borrower to a person. The model only extracts facts (reason, promise, tone).</w:t>
       </w:r>
     </w:p>
     <w:p>
@@ -1001,16 +897,16 @@
           <w:sz w:val="17"/>
           <w:szCs w:val="17"/>
         </w:rPr>
-        <w:t xml:space="preserve">Every call is checked twice. </w:t>
-      </w:r>
-      <w:r>
-        <w:rPr>
-          <w:rFonts w:ascii="Calibri" w:cs="Calibri" w:eastAsia="Calibri" w:hAnsi="Calibri"/>
-          <w:color w:val="11243A"/>
-          <w:sz w:val="17"/>
-          <w:szCs w:val="17"/>
-        </w:rPr>
-        <w:t xml:space="preserve">A model review plus exact checks in code; a flag from either counts as a breach. No waiver or unapproved promise is ever made; a ticket is raised instead.</w:t>
+        <w:t xml:space="preserve">Hard rules and judgement rules, so every verdict can be explained. </w:t>
+      </w:r>
+      <w:r>
+        <w:rPr>
+          <w:rFonts w:ascii="Calibri" w:cs="Calibri" w:eastAsia="Calibri" w:hAnsi="Calibri"/>
+          <w:color w:val="11243A"/>
+          <w:sz w:val="17"/>
+          <w:szCs w:val="17"/>
+        </w:rPr>
+        <w:t xml:space="preserve">Hard rules (one link, no threat, nothing unapproved) are checked in code; judgement rules (listened first) are scored by a model against a quote from the call. AI suggested leaving all judgement to the model; I kept the split because a lender cannot audit a verdict it cannot explain.</w:t>
       </w:r>
     </w:p>
     <w:p>
@@ -1044,11 +940,53 @@
       <w:r>
         <w:rPr>
           <w:rFonts w:ascii="Calibri" w:cs="Calibri" w:eastAsia="Calibri" w:hAnsi="Calibri"/>
+          <w:b/>
+          <w:bCs/>
+          <w:color w:val="11243A"/>
+          <w:sz w:val="17"/>
+          <w:szCs w:val="17"/>
+        </w:rPr>
+        <w:t xml:space="preserve">Pre-bounce awareness calling. </w:t>
+      </w:r>
+      <w:r>
+        <w:rPr>
+          <w:rFonts w:ascii="Calibri" w:cs="Calibri" w:eastAsia="Calibri" w:hAnsi="Calibri"/>
           <w:color w:val="11243A"/>
           <w:sz w:val="16"/>
           <w:szCs w:val="16"/>
         </w:rPr>
-        <w:t xml:space="preserve">No approve-or-override workflow, so the manager sees the route and the reason, not another queue. No field-visit model: the sample never triggers it and I did not invent one. No channel or timing optimisation. No bureau or bank data: one call plus the lender's own history. India-only numbers, no global benchmarks.</w:t>
+        <w:t xml:space="preserve">That is about making the borrower aware in time, which an IVR call or a reminder already does. The talking happens after the bounce, and that is where capturing intent matters, so that is where we started.</w:t>
+      </w:r>
+    </w:p>
+    <w:p>
+      <w:pPr>
+        <w:pStyle w:val="ListParagraph"/>
+        <w:numPr>
+          <w:ilvl w:val="0"/>
+          <w:numId w:val="1"/>
+        </w:numPr>
+        <w:spacing w:after="32" w:line="225"/>
+        <w:ind w:left="190" w:hanging="150"/>
+      </w:pPr>
+      <w:r>
+        <w:rPr>
+          <w:rFonts w:ascii="Calibri" w:cs="Calibri" w:eastAsia="Calibri" w:hAnsi="Calibri"/>
+          <w:b/>
+          <w:bCs/>
+          <w:color w:val="11243A"/>
+          <w:sz w:val="17"/>
+          <w:szCs w:val="17"/>
+        </w:rPr>
+        <w:t xml:space="preserve">One collections playbook for every lender. </w:t>
+      </w:r>
+      <w:r>
+        <w:rPr>
+          <w:rFonts w:ascii="Calibri" w:cs="Calibri" w:eastAsia="Calibri" w:hAnsi="Calibri"/>
+          <w:color w:val="11243A"/>
+          <w:sz w:val="16"/>
+          <w:szCs w:val="16"/>
+        </w:rPr>
+        <w:t xml:space="preserve">Each bank or NBFC sets up its own agent, so the demo journey is a sample, not a standard. We provide the layer beneath any agent, better signals and the next step rather than another collections bot, so teams can build their own agent on it.</w:t>
       </w:r>
     </w:p>
     <w:p>

</xml_diff>

<commit_message>
Product note: three-layer solution, plain English, interview links
Co-Authored-By: Claude Sonnet 5.5 <noreply@anthropic.com>
Claude-Session: https://claude.ai/code/session_01UkYraoXMEPqUCAeqnCcg3Y
</commit_message>
<xml_diff>
--- a/note/product-note.docx
+++ b/note/product-note.docx
@@ -560,7 +560,70 @@
           <w:sz w:val="16"/>
           <w:szCs w:val="16"/>
         </w:rPr>
-        <w:t xml:space="preserve">Three interviews at an Indian lender that runs collections in-house: a product lead, a collections analyst and a data-science lead.</w:t>
+        <w:t xml:space="preserve">Three interviews at an Indian lender that runs collections in-house: </w:t>
+      </w:r>
+      <w:hyperlink w:history="1" r:id="rIdjh_y-bv_55x6gbdw3i2ik">
+        <w:r>
+          <w:rPr>
+            <w:rFonts w:ascii="Calibri" w:cs="Calibri" w:eastAsia="Calibri" w:hAnsi="Calibri"/>
+            <w:color w:val="1A4FD6"/>
+            <w:sz w:val="16"/>
+            <w:szCs w:val="16"/>
+            <w:u w:val="single"/>
+          </w:rPr>
+          <w:t xml:space="preserve">a product lead</w:t>
+        </w:r>
+      </w:hyperlink>
+      <w:r>
+        <w:rPr>
+          <w:rFonts w:ascii="Calibri" w:cs="Calibri" w:eastAsia="Calibri" w:hAnsi="Calibri"/>
+          <w:color w:val="5B6B85"/>
+          <w:sz w:val="16"/>
+          <w:szCs w:val="16"/>
+        </w:rPr>
+        <w:t xml:space="preserve">, </w:t>
+      </w:r>
+      <w:hyperlink w:history="1" r:id="rIdgzoxzfitijm54f6ubsuxh">
+        <w:r>
+          <w:rPr>
+            <w:rFonts w:ascii="Calibri" w:cs="Calibri" w:eastAsia="Calibri" w:hAnsi="Calibri"/>
+            <w:color w:val="1A4FD6"/>
+            <w:sz w:val="16"/>
+            <w:szCs w:val="16"/>
+            <w:u w:val="single"/>
+          </w:rPr>
+          <w:t xml:space="preserve">a collections analyst</w:t>
+        </w:r>
+      </w:hyperlink>
+      <w:r>
+        <w:rPr>
+          <w:rFonts w:ascii="Calibri" w:cs="Calibri" w:eastAsia="Calibri" w:hAnsi="Calibri"/>
+          <w:color w:val="5B6B85"/>
+          <w:sz w:val="16"/>
+          <w:szCs w:val="16"/>
+        </w:rPr>
+        <w:t xml:space="preserve"> and </w:t>
+      </w:r>
+      <w:hyperlink w:history="1" r:id="rIdbbvibdvtl1fzqlu8lgi0x">
+        <w:r>
+          <w:rPr>
+            <w:rFonts w:ascii="Calibri" w:cs="Calibri" w:eastAsia="Calibri" w:hAnsi="Calibri"/>
+            <w:color w:val="1A4FD6"/>
+            <w:sz w:val="16"/>
+            <w:szCs w:val="16"/>
+            <w:u w:val="single"/>
+          </w:rPr>
+          <w:t xml:space="preserve">a data-science lead</w:t>
+        </w:r>
+      </w:hyperlink>
+      <w:r>
+        <w:rPr>
+          <w:rFonts w:ascii="Calibri" w:cs="Calibri" w:eastAsia="Calibri" w:hAnsi="Calibri"/>
+          <w:color w:val="5B6B85"/>
+          <w:sz w:val="16"/>
+          <w:szCs w:val="16"/>
+        </w:rPr>
+        <w:t xml:space="preserve">.</w:t>
       </w:r>
     </w:p>
     <w:p>
@@ -591,7 +654,7 @@
           <w:sz w:val="16"/>
           <w:szCs w:val="16"/>
         </w:rPr>
-        <w:t xml:space="preserve">Bounces drop into the CRM and each agent places 900–1,000 calls a day, repeating until a positive disposition. A promise just schedules a callback. Good agents prioritise in Excel and follow up on WhatsApp, which is encouraged but not tracked.</w:t>
+        <w:t xml:space="preserve">Bounces drop into the CRM and each agent places 900–1,000 calls a day, repeating until a call ends well. A promise just books a callback. Good agents prioritise in Excel and follow up on WhatsApp, which is encouraged but not tracked.</w:t>
       </w:r>
     </w:p>
     <w:p>
@@ -622,7 +685,7 @@
           <w:sz w:val="16"/>
           <w:szCs w:val="16"/>
         </w:rPr>
-        <w:t xml:space="preserve">About 30% of non-payers have an intent problem and 70% a genuine one (medical, salary delay, family), but there is no fixed rule and it varies by agent and region. The record is a one-word disposition.</w:t>
+        <w:t xml:space="preserve">About 30% of non-payers have an intent problem and 70% a genuine one (medical, salary delay, family), but there is no fixed rule and it varies by agent and region. The record is a one-word tag.</w:t>
       </w:r>
     </w:p>
     <w:p>
@@ -653,7 +716,7 @@
           <w:sz w:val="16"/>
           <w:szCs w:val="16"/>
         </w:rPr>
-        <w:t xml:space="preserve">A quality team hears 10–20% of calls. An LLM now scores all of them, and its dispositions match the agents' about 80% of the time.</w:t>
+        <w:t xml:space="preserve">A quality team hears 10–20% of calls. An AI now scores all of them, and its call tags match the agents' about 80% of the time.</w:t>
       </w:r>
     </w:p>
     <w:p>
@@ -707,6 +770,20 @@
     </w:p>
     <w:p>
       <w:pPr>
+        <w:spacing w:after="55" w:line="225"/>
+      </w:pPr>
+      <w:r>
+        <w:rPr>
+          <w:rFonts w:ascii="Calibri" w:cs="Calibri" w:eastAsia="Calibri" w:hAnsi="Calibri"/>
+          <w:color w:val="11243A"/>
+          <w:sz w:val="17"/>
+          <w:szCs w:val="17"/>
+        </w:rPr>
+        <w:t xml:space="preserve">A platform that makes the collection call for you, reviews what happened on it, and then recommends the next step, so you can plan your next collections. It works in three layers.</w:t>
+      </w:r>
+    </w:p>
+    <w:p>
+      <w:pPr>
         <w:pStyle w:val="ListParagraph"/>
         <w:numPr>
           <w:ilvl w:val="0"/>
@@ -724,16 +801,16 @@
           <w:sz w:val="17"/>
           <w:szCs w:val="17"/>
         </w:rPr>
-        <w:t xml:space="preserve">Calls within minutes, in Hindi and Hinglish. </w:t>
-      </w:r>
-      <w:r>
-        <w:rPr>
-          <w:rFonts w:ascii="Calibri" w:cs="Calibri" w:eastAsia="Calibri" w:hAnsi="Calibri"/>
-          <w:color w:val="11243A"/>
-          <w:sz w:val="17"/>
-          <w:szCs w:val="17"/>
-        </w:rPr>
-        <w:t xml:space="preserve">The Razorpay Trusted Collections Agent reaches the borrower while the bounce is hours old.</w:t>
+        <w:t xml:space="preserve">1 · The calling bot. </w:t>
+      </w:r>
+      <w:r>
+        <w:rPr>
+          <w:rFonts w:ascii="Calibri" w:cs="Calibri" w:eastAsia="Calibri" w:hAnsi="Calibri"/>
+          <w:color w:val="11243A"/>
+          <w:sz w:val="17"/>
+          <w:szCs w:val="17"/>
+        </w:rPr>
+        <w:t xml:space="preserve">Calls the borrower within minutes, in Hindi and Hinglish, while the bounce is hours old. It asks why the EMI was missed, listens, and asks for a date and an amount. It follows the lender's rules: confirms who it is speaking to first, sends one payment link, and raises a ticket for anything it cannot promise.</w:t>
       </w:r>
     </w:p>
     <w:p>
@@ -755,16 +832,16 @@
           <w:sz w:val="17"/>
           <w:szCs w:val="17"/>
         </w:rPr>
-        <w:t xml:space="preserve">Negotiates like a good agent, inside the lender's rules. </w:t>
-      </w:r>
-      <w:r>
-        <w:rPr>
-          <w:rFonts w:ascii="Calibri" w:cs="Calibri" w:eastAsia="Calibri" w:hAnsi="Calibri"/>
-          <w:color w:val="11243A"/>
-          <w:sz w:val="17"/>
-          <w:szCs w:val="17"/>
-        </w:rPr>
-        <w:t xml:space="preserve">Identity first, asks why and listens, proposes a date that fits payday, one payment link, a ticket instead of a promise it cannot make.</w:t>
+        <w:t xml:space="preserve">2 · The call review bot. </w:t>
+      </w:r>
+      <w:r>
+        <w:rPr>
+          <w:rFonts w:ascii="Calibri" w:cs="Calibri" w:eastAsia="Calibri" w:hAnsi="Calibri"/>
+          <w:color w:val="11243A"/>
+          <w:sz w:val="17"/>
+          <w:szCs w:val="17"/>
+        </w:rPr>
+        <w:t xml:space="preserve">Reads every call after it ends and notes the reason for the miss, the borrower's mood and how firm the promise was, then checks the call against the lender's rules.</w:t>
       </w:r>
     </w:p>
     <w:p>
@@ -786,16 +863,16 @@
           <w:sz w:val="17"/>
           <w:szCs w:val="17"/>
         </w:rPr>
-        <w:t xml:space="preserve">Turns the call into signals, then recommends and plans the next step. </w:t>
-      </w:r>
-      <w:r>
-        <w:rPr>
-          <w:rFonts w:ascii="Calibri" w:cs="Calibri" w:eastAsia="Calibri" w:hAnsi="Calibri"/>
-          <w:color w:val="11243A"/>
-          <w:sz w:val="17"/>
-          <w:szCs w:val="17"/>
-        </w:rPr>
-        <w:t xml:space="preserve">Reason, tone and promise specificity plus the borrower's history give one route: keep the AI, or hand to a person. The demo borrower makes the point: a firm promise, yet four bounces in six months send him to a person.</w:t>
+        <w:t xml:space="preserve">3 · The bot that recommends an action plan. </w:t>
+      </w:r>
+      <w:r>
+        <w:rPr>
+          <w:rFonts w:ascii="Calibri" w:cs="Calibri" w:eastAsia="Calibri" w:hAnsi="Calibri"/>
+          <w:color w:val="11243A"/>
+          <w:sz w:val="17"/>
+          <w:szCs w:val="17"/>
+        </w:rPr>
+        <w:t xml:space="preserve">Uses the call and the borrower's history to say who should call next, the AI or a person, then turns that into a plan for the cycle: how many calls, how much money, by when. A borrower with a firm promise but four bounces in six months, for example, goes to a person.</w:t>
       </w:r>
     </w:p>
     <w:p>
@@ -1035,38 +1112,7 @@
           <w:sz w:val="17"/>
           <w:szCs w:val="17"/>
         </w:rPr>
-        <w:t xml:space="preserve">A failed debit already fires a webhook, which is the trigger this agent needs, and the payment link and the measurement land on the same rails.</w:t>
-      </w:r>
-    </w:p>
-    <w:p>
-      <w:pPr>
-        <w:pStyle w:val="ListParagraph"/>
-        <w:numPr>
-          <w:ilvl w:val="0"/>
-          <w:numId w:val="1"/>
-        </w:numPr>
-        <w:spacing w:after="32" w:line="225"/>
-        <w:ind w:left="190" w:hanging="150"/>
-      </w:pPr>
-      <w:r>
-        <w:rPr>
-          <w:rFonts w:ascii="Calibri" w:cs="Calibri" w:eastAsia="Calibri" w:hAnsi="Calibri"/>
-          <w:b/>
-          <w:bCs/>
-          <w:color w:val="11243A"/>
-          <w:sz w:val="17"/>
-          <w:szCs w:val="17"/>
-        </w:rPr>
-        <w:t xml:space="preserve">It sells an outcome, not plumbing. </w:t>
-      </w:r>
-      <w:r>
-        <w:rPr>
-          <w:rFonts w:ascii="Calibri" w:cs="Calibri" w:eastAsia="Calibri" w:hAnsi="Calibri"/>
-          <w:color w:val="11243A"/>
-          <w:sz w:val="17"/>
-          <w:szCs w:val="17"/>
-        </w:rPr>
-        <w:t xml:space="preserve">Rupees recovered, priced against ₹11-a-minute human calling, under a regulated aggregator's recorded, rule-scored calls.</w:t>
+        <w:t xml:space="preserve">A failed debit already fires a webhook, which is the trigger this needs, and the payment link and the measurement sit on the same rails. Razorpay would sell rupees recovered, not plumbing.</w:t>
       </w:r>
     </w:p>
     <w:p>
@@ -1650,7 +1696,7 @@
           <w:sz w:val="15"/>
           <w:szCs w:val="15"/>
         </w:rPr>
-        <w:t xml:space="preserve">split one month's bounced EMIs, half through the agent and its routing and half through today's process, and compare rupees collected in nine days and whether routed-to-person cases recover more than if left with the AI. Sample figures are synthetic; weights are uncalibrated and the recommendation is shown, not executed.</w:t>
+        <w:t xml:space="preserve">send half of one month's bounced EMIs through the agent and half through today's process, and compare rupees collected in nine days. Sample figures are synthetic; the weights are not yet tuned and the plan is shown, not executed.</w:t>
       </w:r>
     </w:p>
     <w:sectPr>

</xml_diff>